<commit_message>
Bổ sung ngân hàng TCB cho QR; đổi màu đơn dự trù buồng bệnh
- QR: thêm Techcombank (TCB) vào luồng tạo/hủy/truy vấn trạng thái mã QR
  (QrCodeProcessor, frmCreateTransReqQR). Bổ sung GetCurrentBankCode() suy ra
  mã ngân hàng từ KEY cấu hình khi màn hình gọi không truyền BankName. TCB có
  API hủy giao dịch nên gọi QrPaymentCancel; log rõ khi ngân hàng từ chối hủy.
- Buồng bệnh: đơn thuốc dự trù đổi từ tô cam (DarkOrange) sang xanh lá đậm
  (Green); cập nhật tài liệu nghiệp vụ + kỹ thuật tương ứng.
- frmCareLevel: sdo.CareLevelId nhận đúng kiểu, bỏ .ToString().

Co-Authored-By: Claude Opus 5 (1M context) <noreply@anthropic.com>
</commit_message>
<xml_diff>
--- a/docs/A_NghiepVu_DonDuTruTheoNgayDuTru_BuongBenh.docx
+++ b/docs/A_NghiepVu_DonDuTruTheoNgayDuTru_BuongBenh.docx
@@ -2910,8 +2910,8 @@
         <w:tblLook w:val="04A0" w:firstRow="1" w:lastRow="0" w:firstColumn="1" w:lastColumn="0" w:noHBand="0" w:noVBand="1"/>
       </w:tblPr>
       <w:tblGrid>
-        <w:gridCol w:w="2016"/>
-        <w:gridCol w:w="7328"/>
+        <w:gridCol w:w="1844"/>
+        <w:gridCol w:w="7500"/>
       </w:tblGrid>
       <w:tr>
         <w:tc>
@@ -3266,7 +3266,7 @@
                 <w:sz w:val="19"/>
                 <w:szCs w:val="19"/>
               </w:rPr>
-              <w:t>tô màu cam</w:t>
+              <w:t>tô màu xanh lá đậm</w:t>
             </w:r>
             <w:r>
               <w:rPr>
@@ -6806,7 +6806,29 @@
           <w:sz w:val="21"/>
           <w:szCs w:val="21"/>
         </w:rPr>
-        <w:t>tô màu cam</w:t>
+        <w:t>tô màu xanh lá đ</w:t>
+      </w:r>
+      <w:r>
+        <w:rPr>
+          <w:rFonts w:ascii="Segoe UI" w:hAnsi="Segoe UI" w:cs="Segoe UI"/>
+          <w:b/>
+          <w:bCs/>
+          <w:color w:val="1A1A1A"/>
+          <w:sz w:val="21"/>
+          <w:szCs w:val="21"/>
+        </w:rPr>
+        <w:t>ậ</w:t>
+      </w:r>
+      <w:r>
+        <w:rPr>
+          <w:rFonts w:ascii="Segoe UI" w:hAnsi="Segoe UI" w:cs="Segoe UI"/>
+          <w:b/>
+          <w:bCs/>
+          <w:color w:val="1A1A1A"/>
+          <w:sz w:val="21"/>
+          <w:szCs w:val="21"/>
+        </w:rPr>
+        <w:t>m</w:t>
       </w:r>
       <w:r>
         <w:rPr>
@@ -6869,16 +6891,7 @@
           <w:sz w:val="21"/>
           <w:szCs w:val="21"/>
         </w:rPr>
-        <w:t xml:space="preserve">", đơn </w:t>
-      </w:r>
-      <w:r>
-        <w:rPr>
-          <w:rFonts w:ascii="Segoe UI" w:hAnsi="Segoe UI" w:cs="Segoe UI"/>
-          <w:color w:val="1A1A1A"/>
-          <w:sz w:val="21"/>
-          <w:szCs w:val="21"/>
-        </w:rPr>
-        <w:t>d</w:t>
+        <w:t>", đơn d</w:t>
       </w:r>
       <w:r>
         <w:rPr>
@@ -8344,7 +8357,7 @@
                 <w:sz w:val="19"/>
                 <w:szCs w:val="19"/>
               </w:rPr>
-              <w:t>Thấy đơn ngay, tô cam, Ngày kê 06/08, Ngày dự trù 07/08</w:t>
+              <w:t>Thấy đơn ngay, tô xanh lá đậm, Ngày kê 06/08, Ngày dự trù 07/08</w:t>
             </w:r>
           </w:p>
         </w:tc>
@@ -12474,7 +12487,43 @@
           <w:sz w:val="21"/>
           <w:szCs w:val="21"/>
         </w:rPr>
-        <w:t xml:space="preserve"> cam, </w:t>
+        <w:t xml:space="preserve"> xanh l</w:t>
+      </w:r>
+      <w:r>
+        <w:rPr>
+          <w:rFonts w:ascii="Segoe UI" w:eastAsia="Times New Roman" w:hAnsi="Segoe UI" w:cs="Segoe UI"/>
+          <w:color w:val="1A1A1A"/>
+          <w:sz w:val="21"/>
+          <w:szCs w:val="21"/>
+        </w:rPr>
+        <w:t>á</w:t>
+      </w:r>
+      <w:r>
+        <w:rPr>
+          <w:rFonts w:ascii="Segoe UI" w:eastAsia="Times New Roman" w:hAnsi="Segoe UI" w:cs="Segoe UI"/>
+          <w:color w:val="1A1A1A"/>
+          <w:sz w:val="21"/>
+          <w:szCs w:val="21"/>
+        </w:rPr>
+        <w:t xml:space="preserve"> </w:t>
+      </w:r>
+      <w:r>
+        <w:rPr>
+          <w:rFonts w:ascii="Segoe UI" w:eastAsia="Times New Roman" w:hAnsi="Segoe UI" w:cs="Segoe UI"/>
+          <w:color w:val="1A1A1A"/>
+          <w:sz w:val="21"/>
+          <w:szCs w:val="21"/>
+        </w:rPr>
+        <w:t>đậ</w:t>
+      </w:r>
+      <w:r>
+        <w:rPr>
+          <w:rFonts w:ascii="Segoe UI" w:eastAsia="Times New Roman" w:hAnsi="Segoe UI" w:cs="Segoe UI"/>
+          <w:color w:val="1A1A1A"/>
+          <w:sz w:val="21"/>
+          <w:szCs w:val="21"/>
+        </w:rPr>
+        <w:t xml:space="preserve">m, </w:t>
       </w:r>
       <w:r>
         <w:rPr>
@@ -12812,16 +12861,16 @@
           <w:sz w:val="21"/>
           <w:szCs w:val="21"/>
         </w:rPr>
-        <w:t xml:space="preserve"> trên đầu, tên nhóm ghi đúng ngày kê (QT-</w:t>
-      </w:r>
-      <w:r>
-        <w:rPr>
-          <w:rFonts w:ascii="Segoe UI" w:eastAsia="Times New Roman" w:hAnsi="Segoe UI" w:cs="Segoe UI"/>
-          <w:color w:val="1A1A1A"/>
-          <w:sz w:val="21"/>
-          <w:szCs w:val="21"/>
-        </w:rPr>
-        <w:t>09)</w:t>
+        <w:t xml:space="preserve"> trên đầu, tên nhóm ghi đúng ngày</w:t>
+      </w:r>
+      <w:r>
+        <w:rPr>
+          <w:rFonts w:ascii="Segoe UI" w:eastAsia="Times New Roman" w:hAnsi="Segoe UI" w:cs="Segoe UI"/>
+          <w:color w:val="1A1A1A"/>
+          <w:sz w:val="21"/>
+          <w:szCs w:val="21"/>
+        </w:rPr>
+        <w:t xml:space="preserve"> kê (QT-09)</w:t>
       </w:r>
     </w:p>
     <w:p>
@@ -16395,9 +16444,9 @@
 <file path=word/numbering.xml><?xml version="1.0" encoding="utf-8"?>
 <w:numbering xmlns:wpc="http://schemas.microsoft.com/office/word/2010/wordprocessingCanvas" xmlns:cx="http://schemas.microsoft.com/office/drawing/2014/chartex" xmlns:mc="http://schemas.openxmlformats.org/markup-compatibility/2006" xmlns:o="urn:schemas-microsoft-com:office:office" xmlns:r="http://schemas.openxmlformats.org/officeDocument/2006/relationships" xmlns:m="http://schemas.openxmlformats.org/officeDocument/2006/math" xmlns:v="urn:schemas-microsoft-com:vml" xmlns:wp14="http://schemas.microsoft.com/office/word/2010/wordprocessingDrawing" xmlns:wp="http://schemas.openxmlformats.org/drawingml/2006/wordprocessingDrawing" xmlns:w10="urn:schemas-microsoft-com:office:word" xmlns:w="http://schemas.openxmlformats.org/wordprocessingml/2006/main" xmlns:w14="http://schemas.microsoft.com/office/word/2010/wordml" xmlns:w15="http://schemas.microsoft.com/office/word/2012/wordml" xmlns:w16se="http://schemas.microsoft.com/office/word/2015/wordml/symex" xmlns:wpg="http://schemas.microsoft.com/office/word/2010/wordprocessingGroup" xmlns:wpi="http://schemas.microsoft.com/office/word/2010/wordprocessingInk" xmlns:wne="http://schemas.microsoft.com/office/word/2006/wordml" xmlns:wps="http://schemas.microsoft.com/office/word/2010/wordprocessingShape" mc:Ignorable="w14 w15 w16se wp14">
   <w:abstractNum w:abstractNumId="0" w15:restartNumberingAfterBreak="0">
-    <w:nsid w:val="24CF6068"/>
+    <w:nsid w:val="06C61743"/>
     <w:multiLevelType w:val="multilevel"/>
-    <w:tmpl w:val="9CFA9746"/>
+    <w:tmpl w:val="23EC79D0"/>
     <w:lvl w:ilvl="0">
       <w:start w:val="1"/>
       <w:numFmt w:val="bullet"/>
@@ -16544,9 +16593,9 @@
     </w:lvl>
   </w:abstractNum>
   <w:abstractNum w:abstractNumId="1" w15:restartNumberingAfterBreak="0">
-    <w:nsid w:val="2B907998"/>
+    <w:nsid w:val="1F914035"/>
     <w:multiLevelType w:val="multilevel"/>
-    <w:tmpl w:val="FADA177C"/>
+    <w:tmpl w:val="E7F08708"/>
     <w:lvl w:ilvl="0">
       <w:start w:val="1"/>
       <w:numFmt w:val="bullet"/>
@@ -16693,9 +16742,9 @@
     </w:lvl>
   </w:abstractNum>
   <w:abstractNum w:abstractNumId="2" w15:restartNumberingAfterBreak="0">
-    <w:nsid w:val="47D214FB"/>
+    <w:nsid w:val="27BB57FE"/>
     <w:multiLevelType w:val="multilevel"/>
-    <w:tmpl w:val="35927FB6"/>
+    <w:tmpl w:val="FBDA5F0E"/>
     <w:lvl w:ilvl="0">
       <w:start w:val="1"/>
       <w:numFmt w:val="bullet"/>
@@ -16842,9 +16891,9 @@
     </w:lvl>
   </w:abstractNum>
   <w:abstractNum w:abstractNumId="3" w15:restartNumberingAfterBreak="0">
-    <w:nsid w:val="58230F14"/>
+    <w:nsid w:val="3D635151"/>
     <w:multiLevelType w:val="multilevel"/>
-    <w:tmpl w:val="5A32932E"/>
+    <w:tmpl w:val="90A0E204"/>
     <w:lvl w:ilvl="0">
       <w:start w:val="1"/>
       <w:numFmt w:val="bullet"/>
@@ -16991,9 +17040,9 @@
     </w:lvl>
   </w:abstractNum>
   <w:abstractNum w:abstractNumId="4" w15:restartNumberingAfterBreak="0">
-    <w:nsid w:val="5A036AC3"/>
+    <w:nsid w:val="5AC86A33"/>
     <w:multiLevelType w:val="multilevel"/>
-    <w:tmpl w:val="09A2D854"/>
+    <w:tmpl w:val="EF86B196"/>
     <w:lvl w:ilvl="0">
       <w:start w:val="1"/>
       <w:numFmt w:val="bullet"/>
@@ -17140,9 +17189,9 @@
     </w:lvl>
   </w:abstractNum>
   <w:abstractNum w:abstractNumId="5" w15:restartNumberingAfterBreak="0">
-    <w:nsid w:val="67DF24EE"/>
+    <w:nsid w:val="67A6283F"/>
     <w:multiLevelType w:val="multilevel"/>
-    <w:tmpl w:val="F7C85718"/>
+    <w:tmpl w:val="40B0F710"/>
     <w:lvl w:ilvl="0">
       <w:start w:val="1"/>
       <w:numFmt w:val="bullet"/>
@@ -17289,9 +17338,9 @@
     </w:lvl>
   </w:abstractNum>
   <w:abstractNum w:abstractNumId="6" w15:restartNumberingAfterBreak="0">
-    <w:nsid w:val="6FC356D5"/>
+    <w:nsid w:val="69925A38"/>
     <w:multiLevelType w:val="multilevel"/>
-    <w:tmpl w:val="087847E0"/>
+    <w:tmpl w:val="B6FC70D0"/>
     <w:lvl w:ilvl="0">
       <w:start w:val="1"/>
       <w:numFmt w:val="bullet"/>
@@ -17438,25 +17487,25 @@
     </w:lvl>
   </w:abstractNum>
   <w:num w:numId="1">
+    <w:abstractNumId w:val="5"/>
+  </w:num>
+  <w:num w:numId="2">
+    <w:abstractNumId w:val="4"/>
+  </w:num>
+  <w:num w:numId="3">
+    <w:abstractNumId w:val="3"/>
+  </w:num>
+  <w:num w:numId="4">
     <w:abstractNumId w:val="1"/>
   </w:num>
-  <w:num w:numId="2">
-    <w:abstractNumId w:val="0"/>
-  </w:num>
-  <w:num w:numId="3">
-    <w:abstractNumId w:val="5"/>
-  </w:num>
-  <w:num w:numId="4">
-    <w:abstractNumId w:val="3"/>
-  </w:num>
   <w:num w:numId="5">
-    <w:abstractNumId w:val="4"/>
+    <w:abstractNumId w:val="6"/>
   </w:num>
   <w:num w:numId="6">
     <w:abstractNumId w:val="2"/>
   </w:num>
   <w:num w:numId="7">
-    <w:abstractNumId w:val="6"/>
+    <w:abstractNumId w:val="0"/>
   </w:num>
 </w:numbering>
 </file>
@@ -18099,7 +18148,7 @@
     <w:link w:val="HeaderChar"/>
     <w:uiPriority w:val="99"/>
     <w:unhideWhenUsed/>
-    <w:rsid w:val="00ED0B3C"/>
+    <w:rsid w:val="007577DE"/>
     <w:pPr>
       <w:tabs>
         <w:tab w:val="center" w:pos="4680"/>
@@ -18112,7 +18161,7 @@
     <w:basedOn w:val="DefaultParagraphFont"/>
     <w:link w:val="Header"/>
     <w:uiPriority w:val="99"/>
-    <w:rsid w:val="00ED0B3C"/>
+    <w:rsid w:val="007577DE"/>
     <w:rPr>
       <w:rFonts w:eastAsiaTheme="minorEastAsia"/>
       <w:sz w:val="24"/>
@@ -18125,7 +18174,7 @@
     <w:link w:val="FooterChar"/>
     <w:uiPriority w:val="99"/>
     <w:unhideWhenUsed/>
-    <w:rsid w:val="00ED0B3C"/>
+    <w:rsid w:val="007577DE"/>
     <w:pPr>
       <w:tabs>
         <w:tab w:val="center" w:pos="4680"/>
@@ -18138,7 +18187,7 @@
     <w:basedOn w:val="DefaultParagraphFont"/>
     <w:link w:val="Footer"/>
     <w:uiPriority w:val="99"/>
-    <w:rsid w:val="00ED0B3C"/>
+    <w:rsid w:val="007577DE"/>
     <w:rPr>
       <w:rFonts w:eastAsiaTheme="minorEastAsia"/>
       <w:sz w:val="24"/>
@@ -18151,7 +18200,7 @@
     <w:uiPriority w:val="99"/>
     <w:semiHidden/>
     <w:unhideWhenUsed/>
-    <w:rsid w:val="00ED0B3C"/>
+    <w:rsid w:val="007577DE"/>
   </w:style>
 </w:styles>
 </file>

</xml_diff>

<commit_message>
Buong benh: doi mau danh dau don du tru sang xanh da troi
- UCTreeListService.cs (treeSereServ_NodeCellStyle): Color.DarkOrange ->
  Color.DodgerBlue (QT-08).
  Chon DodgerBlue thay vi SkyBlue vi SkyBlue qua nhat tren nen trang
  (tuong phan ~1.7:1), kho doc ten thuoc tren luoi.
- Dong bo tai lieu nghiep vu, ky thuat va changelog module theo mau moi.
</commit_message>
<xml_diff>
--- a/docs/A_NghiepVu_DonDuTruTheoNgayDuTru_BuongBenh.docx
+++ b/docs/A_NghiepVu_DonDuTruTheoNgayDuTru_BuongBenh.docx
@@ -2910,8 +2910,8 @@
         <w:tblLook w:val="04A0" w:firstRow="1" w:lastRow="0" w:firstColumn="1" w:lastColumn="0" w:noHBand="0" w:noVBand="1"/>
       </w:tblPr>
       <w:tblGrid>
-        <w:gridCol w:w="1844"/>
-        <w:gridCol w:w="7500"/>
+        <w:gridCol w:w="1846"/>
+        <w:gridCol w:w="7498"/>
       </w:tblGrid>
       <w:tr>
         <w:tc>
@@ -3266,7 +3266,7 @@
                 <w:sz w:val="19"/>
                 <w:szCs w:val="19"/>
               </w:rPr>
-              <w:t>tô màu xanh lá đậm</w:t>
+              <w:t>tô màu xanh da trời</w:t>
             </w:r>
             <w:r>
               <w:rPr>
@@ -6806,7 +6806,7 @@
           <w:sz w:val="21"/>
           <w:szCs w:val="21"/>
         </w:rPr>
-        <w:t>tô màu xanh lá đ</w:t>
+        <w:t>tô màu xanh da tr</w:t>
       </w:r>
       <w:r>
         <w:rPr>
@@ -6817,7 +6817,7 @@
           <w:sz w:val="21"/>
           <w:szCs w:val="21"/>
         </w:rPr>
-        <w:t>ậ</w:t>
+        <w:t>ờ</w:t>
       </w:r>
       <w:r>
         <w:rPr>
@@ -6828,7 +6828,7 @@
           <w:sz w:val="21"/>
           <w:szCs w:val="21"/>
         </w:rPr>
-        <w:t>m</w:t>
+        <w:t>i</w:t>
       </w:r>
       <w:r>
         <w:rPr>
@@ -6873,7 +6873,16 @@
           <w:sz w:val="21"/>
           <w:szCs w:val="21"/>
         </w:rPr>
-        <w:t>t c</w:t>
+        <w:t xml:space="preserve">t </w:t>
+      </w:r>
+      <w:r>
+        <w:rPr>
+          <w:rFonts w:ascii="Segoe UI" w:hAnsi="Segoe UI" w:cs="Segoe UI"/>
+          <w:color w:val="1A1A1A"/>
+          <w:sz w:val="21"/>
+          <w:szCs w:val="21"/>
+        </w:rPr>
+        <w:t>c</w:t>
       </w:r>
       <w:r>
         <w:rPr>
@@ -8357,7 +8366,7 @@
                 <w:sz w:val="19"/>
                 <w:szCs w:val="19"/>
               </w:rPr>
-              <w:t>Thấy đơn ngay, tô xanh lá đậm, Ngày kê 06/08, Ngày dự trù 07/08</w:t>
+              <w:t>Thấy đơn ngay, tô xanh da trời, Ngày kê 06/08, Ngày dự trù 07/08</w:t>
             </w:r>
           </w:p>
         </w:tc>
@@ -12487,43 +12496,25 @@
           <w:sz w:val="21"/>
           <w:szCs w:val="21"/>
         </w:rPr>
-        <w:t xml:space="preserve"> xanh l</w:t>
-      </w:r>
-      <w:r>
-        <w:rPr>
-          <w:rFonts w:ascii="Segoe UI" w:eastAsia="Times New Roman" w:hAnsi="Segoe UI" w:cs="Segoe UI"/>
-          <w:color w:val="1A1A1A"/>
-          <w:sz w:val="21"/>
-          <w:szCs w:val="21"/>
-        </w:rPr>
-        <w:t>á</w:t>
-      </w:r>
-      <w:r>
-        <w:rPr>
-          <w:rFonts w:ascii="Segoe UI" w:eastAsia="Times New Roman" w:hAnsi="Segoe UI" w:cs="Segoe UI"/>
-          <w:color w:val="1A1A1A"/>
-          <w:sz w:val="21"/>
-          <w:szCs w:val="21"/>
-        </w:rPr>
-        <w:t xml:space="preserve"> </w:t>
-      </w:r>
-      <w:r>
-        <w:rPr>
-          <w:rFonts w:ascii="Segoe UI" w:eastAsia="Times New Roman" w:hAnsi="Segoe UI" w:cs="Segoe UI"/>
-          <w:color w:val="1A1A1A"/>
-          <w:sz w:val="21"/>
-          <w:szCs w:val="21"/>
-        </w:rPr>
-        <w:t>đậ</w:t>
-      </w:r>
-      <w:r>
-        <w:rPr>
-          <w:rFonts w:ascii="Segoe UI" w:eastAsia="Times New Roman" w:hAnsi="Segoe UI" w:cs="Segoe UI"/>
-          <w:color w:val="1A1A1A"/>
-          <w:sz w:val="21"/>
-          <w:szCs w:val="21"/>
-        </w:rPr>
-        <w:t xml:space="preserve">m, </w:t>
+        <w:t xml:space="preserve"> xanh da tr</w:t>
+      </w:r>
+      <w:r>
+        <w:rPr>
+          <w:rFonts w:ascii="Segoe UI" w:eastAsia="Times New Roman" w:hAnsi="Segoe UI" w:cs="Segoe UI"/>
+          <w:color w:val="1A1A1A"/>
+          <w:sz w:val="21"/>
+          <w:szCs w:val="21"/>
+        </w:rPr>
+        <w:t>ờ</w:t>
+      </w:r>
+      <w:r>
+        <w:rPr>
+          <w:rFonts w:ascii="Segoe UI" w:eastAsia="Times New Roman" w:hAnsi="Segoe UI" w:cs="Segoe UI"/>
+          <w:color w:val="1A1A1A"/>
+          <w:sz w:val="21"/>
+          <w:szCs w:val="21"/>
+        </w:rPr>
+        <w:t xml:space="preserve">i, </w:t>
       </w:r>
       <w:r>
         <w:rPr>
@@ -12861,16 +12852,16 @@
           <w:sz w:val="21"/>
           <w:szCs w:val="21"/>
         </w:rPr>
-        <w:t xml:space="preserve"> trên đầu, tên nhóm ghi đúng ngày</w:t>
-      </w:r>
-      <w:r>
-        <w:rPr>
-          <w:rFonts w:ascii="Segoe UI" w:eastAsia="Times New Roman" w:hAnsi="Segoe UI" w:cs="Segoe UI"/>
-          <w:color w:val="1A1A1A"/>
-          <w:sz w:val="21"/>
-          <w:szCs w:val="21"/>
-        </w:rPr>
-        <w:t xml:space="preserve"> kê (QT-09)</w:t>
+        <w:t xml:space="preserve"> trên đầu, tên nhóm ghi đúng ngà</w:t>
+      </w:r>
+      <w:r>
+        <w:rPr>
+          <w:rFonts w:ascii="Segoe UI" w:eastAsia="Times New Roman" w:hAnsi="Segoe UI" w:cs="Segoe UI"/>
+          <w:color w:val="1A1A1A"/>
+          <w:sz w:val="21"/>
+          <w:szCs w:val="21"/>
+        </w:rPr>
+        <w:t>y kê (QT-09)</w:t>
       </w:r>
     </w:p>
     <w:p>
@@ -16444,9 +16435,9 @@
 <file path=word/numbering.xml><?xml version="1.0" encoding="utf-8"?>
 <w:numbering xmlns:wpc="http://schemas.microsoft.com/office/word/2010/wordprocessingCanvas" xmlns:cx="http://schemas.microsoft.com/office/drawing/2014/chartex" xmlns:mc="http://schemas.openxmlformats.org/markup-compatibility/2006" xmlns:o="urn:schemas-microsoft-com:office:office" xmlns:r="http://schemas.openxmlformats.org/officeDocument/2006/relationships" xmlns:m="http://schemas.openxmlformats.org/officeDocument/2006/math" xmlns:v="urn:schemas-microsoft-com:vml" xmlns:wp14="http://schemas.microsoft.com/office/word/2010/wordprocessingDrawing" xmlns:wp="http://schemas.openxmlformats.org/drawingml/2006/wordprocessingDrawing" xmlns:w10="urn:schemas-microsoft-com:office:word" xmlns:w="http://schemas.openxmlformats.org/wordprocessingml/2006/main" xmlns:w14="http://schemas.microsoft.com/office/word/2010/wordml" xmlns:w15="http://schemas.microsoft.com/office/word/2012/wordml" xmlns:w16se="http://schemas.microsoft.com/office/word/2015/wordml/symex" xmlns:wpg="http://schemas.microsoft.com/office/word/2010/wordprocessingGroup" xmlns:wpi="http://schemas.microsoft.com/office/word/2010/wordprocessingInk" xmlns:wne="http://schemas.microsoft.com/office/word/2006/wordml" xmlns:wps="http://schemas.microsoft.com/office/word/2010/wordprocessingShape" mc:Ignorable="w14 w15 w16se wp14">
   <w:abstractNum w:abstractNumId="0" w15:restartNumberingAfterBreak="0">
-    <w:nsid w:val="06C61743"/>
+    <w:nsid w:val="0EFD23BB"/>
     <w:multiLevelType w:val="multilevel"/>
-    <w:tmpl w:val="23EC79D0"/>
+    <w:tmpl w:val="0D12B76C"/>
     <w:lvl w:ilvl="0">
       <w:start w:val="1"/>
       <w:numFmt w:val="bullet"/>
@@ -16593,9 +16584,9 @@
     </w:lvl>
   </w:abstractNum>
   <w:abstractNum w:abstractNumId="1" w15:restartNumberingAfterBreak="0">
-    <w:nsid w:val="1F914035"/>
+    <w:nsid w:val="1DAF7ECE"/>
     <w:multiLevelType w:val="multilevel"/>
-    <w:tmpl w:val="E7F08708"/>
+    <w:tmpl w:val="E53AA632"/>
     <w:lvl w:ilvl="0">
       <w:start w:val="1"/>
       <w:numFmt w:val="bullet"/>
@@ -16742,9 +16733,9 @@
     </w:lvl>
   </w:abstractNum>
   <w:abstractNum w:abstractNumId="2" w15:restartNumberingAfterBreak="0">
-    <w:nsid w:val="27BB57FE"/>
+    <w:nsid w:val="23634C93"/>
     <w:multiLevelType w:val="multilevel"/>
-    <w:tmpl w:val="FBDA5F0E"/>
+    <w:tmpl w:val="C6F079D2"/>
     <w:lvl w:ilvl="0">
       <w:start w:val="1"/>
       <w:numFmt w:val="bullet"/>
@@ -16891,9 +16882,9 @@
     </w:lvl>
   </w:abstractNum>
   <w:abstractNum w:abstractNumId="3" w15:restartNumberingAfterBreak="0">
-    <w:nsid w:val="3D635151"/>
+    <w:nsid w:val="544A7586"/>
     <w:multiLevelType w:val="multilevel"/>
-    <w:tmpl w:val="90A0E204"/>
+    <w:tmpl w:val="D0724F9E"/>
     <w:lvl w:ilvl="0">
       <w:start w:val="1"/>
       <w:numFmt w:val="bullet"/>
@@ -17040,9 +17031,9 @@
     </w:lvl>
   </w:abstractNum>
   <w:abstractNum w:abstractNumId="4" w15:restartNumberingAfterBreak="0">
-    <w:nsid w:val="5AC86A33"/>
+    <w:nsid w:val="5EE24DAF"/>
     <w:multiLevelType w:val="multilevel"/>
-    <w:tmpl w:val="EF86B196"/>
+    <w:tmpl w:val="D7FECFDA"/>
     <w:lvl w:ilvl="0">
       <w:start w:val="1"/>
       <w:numFmt w:val="bullet"/>
@@ -17189,9 +17180,9 @@
     </w:lvl>
   </w:abstractNum>
   <w:abstractNum w:abstractNumId="5" w15:restartNumberingAfterBreak="0">
-    <w:nsid w:val="67A6283F"/>
+    <w:nsid w:val="61F94B95"/>
     <w:multiLevelType w:val="multilevel"/>
-    <w:tmpl w:val="40B0F710"/>
+    <w:tmpl w:val="8E025E90"/>
     <w:lvl w:ilvl="0">
       <w:start w:val="1"/>
       <w:numFmt w:val="bullet"/>
@@ -17338,9 +17329,9 @@
     </w:lvl>
   </w:abstractNum>
   <w:abstractNum w:abstractNumId="6" w15:restartNumberingAfterBreak="0">
-    <w:nsid w:val="69925A38"/>
+    <w:nsid w:val="76501E46"/>
     <w:multiLevelType w:val="multilevel"/>
-    <w:tmpl w:val="B6FC70D0"/>
+    <w:tmpl w:val="4F7E24E4"/>
     <w:lvl w:ilvl="0">
       <w:start w:val="1"/>
       <w:numFmt w:val="bullet"/>
@@ -17490,22 +17481,22 @@
     <w:abstractNumId w:val="5"/>
   </w:num>
   <w:num w:numId="2">
-    <w:abstractNumId w:val="4"/>
+    <w:abstractNumId w:val="0"/>
   </w:num>
   <w:num w:numId="3">
-    <w:abstractNumId w:val="3"/>
+    <w:abstractNumId w:val="1"/>
   </w:num>
   <w:num w:numId="4">
-    <w:abstractNumId w:val="1"/>
+    <w:abstractNumId w:val="2"/>
   </w:num>
   <w:num w:numId="5">
     <w:abstractNumId w:val="6"/>
   </w:num>
   <w:num w:numId="6">
-    <w:abstractNumId w:val="2"/>
+    <w:abstractNumId w:val="3"/>
   </w:num>
   <w:num w:numId="7">
-    <w:abstractNumId w:val="0"/>
+    <w:abstractNumId w:val="4"/>
   </w:num>
 </w:numbering>
 </file>
@@ -18148,7 +18139,7 @@
     <w:link w:val="HeaderChar"/>
     <w:uiPriority w:val="99"/>
     <w:unhideWhenUsed/>
-    <w:rsid w:val="007577DE"/>
+    <w:rsid w:val="006F6200"/>
     <w:pPr>
       <w:tabs>
         <w:tab w:val="center" w:pos="4680"/>
@@ -18161,7 +18152,7 @@
     <w:basedOn w:val="DefaultParagraphFont"/>
     <w:link w:val="Header"/>
     <w:uiPriority w:val="99"/>
-    <w:rsid w:val="007577DE"/>
+    <w:rsid w:val="006F6200"/>
     <w:rPr>
       <w:rFonts w:eastAsiaTheme="minorEastAsia"/>
       <w:sz w:val="24"/>
@@ -18174,7 +18165,7 @@
     <w:link w:val="FooterChar"/>
     <w:uiPriority w:val="99"/>
     <w:unhideWhenUsed/>
-    <w:rsid w:val="007577DE"/>
+    <w:rsid w:val="006F6200"/>
     <w:pPr>
       <w:tabs>
         <w:tab w:val="center" w:pos="4680"/>
@@ -18187,7 +18178,7 @@
     <w:basedOn w:val="DefaultParagraphFont"/>
     <w:link w:val="Footer"/>
     <w:uiPriority w:val="99"/>
-    <w:rsid w:val="007577DE"/>
+    <w:rsid w:val="006F6200"/>
     <w:rPr>
       <w:rFonts w:eastAsiaTheme="minorEastAsia"/>
       <w:sz w:val="24"/>
@@ -18200,7 +18191,7 @@
     <w:uiPriority w:val="99"/>
     <w:semiHidden/>
     <w:unhideWhenUsed/>
-    <w:rsid w:val="007577DE"/>
+    <w:rsid w:val="006F6200"/>
   </w:style>
 </w:styles>
 </file>

</xml_diff>